<commit_message>
feat: report export follow-ups (janitor, PDF, review-matrix annex)
Boot janitor fails report_exports rows orphaned by a hard worker
death (BullMQ stalled re-delivery is a no-op against the queued-only
idempotency guard). Optional pdf output converts the filled DOCX via
Gotenberg behind a stubbed delivery seam; format rides on job data,
no schema change. Built-in template gains an annex table (one row
per contract with a pre-joined field summary; true dynamic-column
matrix stays deferred pending engine cell-repeat). Download scratch
keys move under a root exports/ prefix so a bucket lifecycle rule
can expire them.
</commit_message>
<xml_diff>
--- a/apps/api/src/handlers/reports/assets/dd-report.docx
+++ b/apps/api/src/handlers/reports/assets/dd-report.docx
@@ -205,6 +205,83 @@
         <w:t xml:space="preserve">{{/each}}</w:t>
       </w:r>
     </w:p>
+    <w:p>
+      <w:pPr>
+        <w:pStyle w:val="Heading1"/>
+      </w:pPr>
+      <w:r>
+        <w:t xml:space="preserve">Annex — Review matrix</w:t>
+      </w:r>
+    </w:p>
+    <w:p>
+      <w:r>
+        <w:t xml:space="preserve">A consolidated overview of every reviewed contract and its extracted columns.</w:t>
+      </w:r>
+    </w:p>
+    <w:tbl>
+      <w:tblPr>
+        <w:tblStyle w:val="TableGrid"/>
+        <w:tblW w:w="0" w:type="auto"/>
+      </w:tblPr>
+      <w:tblGrid>
+        <w:gridCol/>
+        <w:gridCol/>
+      </w:tblGrid>
+      <w:tr>
+        <w:tc>
+          <w:tcPr>
+            <w:tcW w:w="0" w:type="auto"/>
+          </w:tcPr>
+          <w:p>
+            <w:r>
+              <w:t xml:space="preserve">Contract</w:t>
+            </w:r>
+          </w:p>
+        </w:tc>
+        <w:tc>
+          <w:tcPr>
+            <w:tcW w:w="0" w:type="auto"/>
+          </w:tcPr>
+          <w:p>
+            <w:r>
+              <w:t xml:space="preserve">Review summary</w:t>
+            </w:r>
+          </w:p>
+        </w:tc>
+      </w:tr>
+      <w:tr>
+        <w:tc>
+          <w:tcPr>
+            <w:tcW w:w="0" w:type="auto"/>
+          </w:tcPr>
+          <w:p>
+            <w:r>
+              <w:t xml:space="preserve">{{#each grid.rows}}</w:t>
+            </w:r>
+          </w:p>
+          <w:p>
+            <w:r>
+              <w:t xml:space="preserve">{{grid.rows.name}}</w:t>
+            </w:r>
+          </w:p>
+        </w:tc>
+        <w:tc>
+          <w:tcPr>
+            <w:tcW w:w="0" w:type="auto"/>
+          </w:tcPr>
+          <w:p>
+            <w:r>
+              <w:t xml:space="preserve">{{grid.rows.summary}}</w:t>
+            </w:r>
+          </w:p>
+          <w:p>
+            <w:r>
+              <w:t xml:space="preserve">{{/each}}</w:t>
+            </w:r>
+          </w:p>
+        </w:tc>
+      </w:tr>
+    </w:tbl>
   </w:body>
 </w:document>
 </file>

</xml_diff>

<commit_message>
feat: report export polish (general toast key, customize built-in, AI toggle)
The progress toast reuses a new general common.preparing key.
Customize clones the built-in DD template into the org's report
templates, carrying its manifest verbatim (createStoredTemplate
gains an authoritative-manifest option so nested per-item AI
fields survive; discovery path unchanged). An Include-AI-summaries
toggle gates the narrative sections via {{#if aiNarrative}} in the
template, skipping all model calls and usage preflight when off.
</commit_message>
<xml_diff>
--- a/apps/api/src/handlers/reports/assets/dd-report.docx
+++ b/apps/api/src/handlers/reports/assets/dd-report.docx
@@ -20,7 +20,17 @@
     </w:p>
     <w:p>
       <w:r>
+        <w:t xml:space="preserve">{{#if aiNarrative}}</w:t>
+      </w:r>
+    </w:p>
+    <w:p>
+      <w:r>
         <w:t xml:space="preserve">{{execSummary}}</w:t>
+      </w:r>
+    </w:p>
+    <w:p>
+      <w:r>
+        <w:t xml:space="preserve">{{/if}}</w:t>
       </w:r>
     </w:p>
     <w:p>
@@ -188,6 +198,11 @@
       </w:r>
     </w:p>
     <w:p>
+      <w:r>
+        <w:t xml:space="preserve">{{#if aiNarrative}}</w:t>
+      </w:r>
+    </w:p>
+    <w:p>
       <w:pPr>
         <w:pStyle w:val="Heading3"/>
       </w:pPr>
@@ -198,6 +213,11 @@
     <w:p>
       <w:r>
         <w:t xml:space="preserve">{{contracts.summary}}</w:t>
+      </w:r>
+    </w:p>
+    <w:p>
+      <w:r>
+        <w:t xml:space="preserve">{{/if}}</w:t>
       </w:r>
     </w:p>
     <w:p>

</xml_diff>

<commit_message>
chore(api): regenerate the due-diligence report template from its script
The codemod rewrote the stored asset in place, and the run-preserving patcher
splits a run where it replaces a sub-range, so the loop counter and the text
after it landed in separate runs. The asset has a generator; running it emits
the same markers with the runs the document is meant to have.
</commit_message>
<xml_diff>
--- a/apps/api/src/handlers/reports/assets/dd-report.docx
+++ b/apps/api/src/handlers/reports/assets/dd-report.docx
@@ -44,9 +44,6 @@
     </w:p>
     <w:p>
       <w:r>
-        <w:t xml:space="preserve"/>
-      </w:r>
-      <w:r>
         <w:t xml:space="preserve">{% if aiNarrative %}</w:t>
       </w:r>
     </w:p>
@@ -60,16 +57,10 @@
     </w:p>
     <w:p>
       <w:r>
-        <w:t xml:space="preserve"/>
-      </w:r>
-      <w:r>
         <w:t xml:space="preserve">{% endif %}</w:t>
       </w:r>
     </w:p>
     <w:p>
-      <w:r>
-        <w:t xml:space="preserve"/>
-      </w:r>
       <w:r>
         <w:t xml:space="preserve">{% if hasVerdicts %}</w:t>
       </w:r>
@@ -359,9 +350,6 @@
     </w:tbl>
     <w:p>
       <w:r>
-        <w:t xml:space="preserve"/>
-      </w:r>
-      <w:r>
         <w:t xml:space="preserve">{% else %}</w:t>
       </w:r>
     </w:p>
@@ -435,9 +423,6 @@
     </w:tbl>
     <w:p>
       <w:r>
-        <w:t xml:space="preserve"/>
-      </w:r>
-      <w:r>
         <w:t xml:space="preserve">{% endif %}</w:t>
       </w:r>
     </w:p>
@@ -451,9 +436,6 @@
     </w:p>
     <w:p>
       <w:r>
-        <w:t xml:space="preserve"/>
-      </w:r>
-      <w:r>
         <w:t xml:space="preserve">{% for contract in contracts %}</w:t>
       </w:r>
     </w:p>
@@ -462,22 +444,10 @@
         <w:pStyle w:val="Heading2"/>
       </w:pPr>
       <w:r>
-        <w:t xml:space="preserve"/>
-      </w:r>
-      <w:r>
-        <w:t xml:space="preserve">{{ loop.index }}</w:t>
-      </w:r>
-      <w:r>
-        <w:t xml:space="preserve">. </w:t>
-      </w:r>
-      <w:r>
-        <w:t xml:space="preserve">{{ contract.name }}</w:t>
-      </w:r>
-    </w:p>
-    <w:p>
-      <w:r>
-        <w:t xml:space="preserve"/>
-      </w:r>
+        <w:t xml:space="preserve">{{ loop.index }}. {{ contract.name }}</w:t>
+      </w:r>
+    </w:p>
+    <w:p>
       <w:r>
         <w:t xml:space="preserve">{% if contract.hasDocumentType %}</w:t>
       </w:r>
@@ -487,25 +457,16 @@
         <w:pStyle w:val="Caption"/>
       </w:pPr>
       <w:r>
-        <w:t xml:space="preserve">Document type: </w:t>
-      </w:r>
-      <w:r>
-        <w:t xml:space="preserve">{{ contract.documentType }}</w:t>
-      </w:r>
-    </w:p>
-    <w:p>
-      <w:r>
-        <w:t xml:space="preserve"/>
-      </w:r>
+        <w:t xml:space="preserve">Document type: {{ contract.documentType }}</w:t>
+      </w:r>
+    </w:p>
+    <w:p>
       <w:r>
         <w:t xml:space="preserve">{% endif %}</w:t>
       </w:r>
     </w:p>
     <w:p>
       <w:r>
-        <w:t xml:space="preserve"/>
-      </w:r>
-      <w:r>
         <w:t xml:space="preserve">{% if contract.hasRiskLevel %}</w:t>
       </w:r>
     </w:p>
@@ -514,24 +475,15 @@
         <w:pStyle w:val="Caption"/>
       </w:pPr>
       <w:r>
-        <w:t xml:space="preserve">Risk level: </w:t>
-      </w:r>
-      <w:r>
-        <w:t xml:space="preserve">{{ contract.riskLevel }}</w:t>
-      </w:r>
-    </w:p>
-    <w:p>
-      <w:r>
-        <w:t xml:space="preserve"/>
-      </w:r>
+        <w:t xml:space="preserve">Risk level: {{ contract.riskLevel }}</w:t>
+      </w:r>
+    </w:p>
+    <w:p>
       <w:r>
         <w:t xml:space="preserve">{% endif %}</w:t>
       </w:r>
     </w:p>
     <w:p>
-      <w:r>
-        <w:t xml:space="preserve"/>
-      </w:r>
       <w:r>
         <w:t xml:space="preserve">{% if hasVerdicts %}</w:t>
       </w:r>
@@ -642,9 +594,6 @@
           </w:tcPr>
           <w:p>
             <w:r>
-              <w:t xml:space="preserve"/>
-            </w:r>
-            <w:r>
               <w:t xml:space="preserve">{% for field in contract.fields %}</w:t>
             </w:r>
           </w:p>
@@ -658,14 +607,6 @@
                 <w:sz w:val="20"/>
                 <w:szCs w:val="20"/>
               </w:rPr>
-              <w:t xml:space="preserve"/>
-            </w:r>
-            <w:r>
-              <w:rPr>
-                <w:b/>
-                <w:sz w:val="20"/>
-                <w:szCs w:val="20"/>
-              </w:rPr>
               <w:t xml:space="preserve">{{ field.label }}</w:t>
             </w:r>
           </w:p>
@@ -684,13 +625,6 @@
                 <w:sz w:val="20"/>
                 <w:szCs w:val="20"/>
               </w:rPr>
-              <w:t xml:space="preserve"/>
-            </w:r>
-            <w:r>
-              <w:rPr>
-                <w:sz w:val="20"/>
-                <w:szCs w:val="20"/>
-              </w:rPr>
               <w:t xml:space="preserve">{{ field.value }}</w:t>
             </w:r>
           </w:p>
@@ -709,20 +643,10 @@
                 <w:sz w:val="20"/>
                 <w:szCs w:val="20"/>
               </w:rPr>
-              <w:t xml:space="preserve"/>
-            </w:r>
-            <w:r>
-              <w:rPr>
-                <w:sz w:val="20"/>
-                <w:szCs w:val="20"/>
-              </w:rPr>
               <w:t xml:space="preserve">{{ field.verdict }}</w:t>
             </w:r>
           </w:p>
           <w:p>
-            <w:r>
-              <w:t xml:space="preserve"/>
-            </w:r>
             <w:r>
               <w:t xml:space="preserve">{% endfor %}</w:t>
             </w:r>
@@ -731,9 +655,6 @@
       </w:tr>
     </w:tbl>
     <w:p>
-      <w:r>
-        <w:t xml:space="preserve"/>
-      </w:r>
       <w:r>
         <w:t xml:space="preserve">{% else %}</w:t>
       </w:r>
@@ -822,9 +743,6 @@
           </w:tcPr>
           <w:p>
             <w:r>
-              <w:t xml:space="preserve"/>
-            </w:r>
-            <w:r>
               <w:t xml:space="preserve">{% for field in contract.fields %}</w:t>
             </w:r>
           </w:p>
@@ -838,14 +756,6 @@
                 <w:sz w:val="20"/>
                 <w:szCs w:val="20"/>
               </w:rPr>
-              <w:t xml:space="preserve"/>
-            </w:r>
-            <w:r>
-              <w:rPr>
-                <w:b/>
-                <w:sz w:val="20"/>
-                <w:szCs w:val="20"/>
-              </w:rPr>
               <w:t xml:space="preserve">{{ field.label }}</w:t>
             </w:r>
           </w:p>
@@ -864,20 +774,10 @@
                 <w:sz w:val="20"/>
                 <w:szCs w:val="20"/>
               </w:rPr>
-              <w:t xml:space="preserve"/>
-            </w:r>
-            <w:r>
-              <w:rPr>
-                <w:sz w:val="20"/>
-                <w:szCs w:val="20"/>
-              </w:rPr>
               <w:t xml:space="preserve">{{ field.value }}</w:t>
             </w:r>
           </w:p>
           <w:p>
-            <w:r>
-              <w:t xml:space="preserve"/>
-            </w:r>
             <w:r>
               <w:t xml:space="preserve">{% endfor %}</w:t>
             </w:r>
@@ -887,17 +787,11 @@
     </w:tbl>
     <w:p>
       <w:r>
-        <w:t xml:space="preserve"/>
-      </w:r>
-      <w:r>
         <w:t xml:space="preserve">{% endif %}</w:t>
       </w:r>
     </w:p>
     <w:p>
       <w:r>
-        <w:t xml:space="preserve"/>
-      </w:r>
-      <w:r>
         <w:t xml:space="preserve">{% if contract.hasRisks %}</w:t>
       </w:r>
     </w:p>
@@ -910,9 +804,6 @@
       </w:r>
     </w:p>
     <w:p>
-      <w:r>
-        <w:t xml:space="preserve"/>
-      </w:r>
       <w:r>
         <w:t xml:space="preserve">{% for risk in contract.risks %}</w:t>
       </w:r>
@@ -925,37 +816,7 @@
         <w:rPr>
           <w:b/>
         </w:rPr>
-        <w:t xml:space="preserve"/>
-      </w:r>
-      <w:r>
-        <w:rPr>
-          <w:b/>
-        </w:rPr>
-        <w:t xml:space="preserve">{{ risk.issue }}</w:t>
-      </w:r>
-      <w:r>
-        <w:rPr>
-          <w:b/>
-        </w:rPr>
-        <w:t xml:space="preserve">  ·  </w:t>
-      </w:r>
-      <w:r>
-        <w:rPr>
-          <w:b/>
-        </w:rPr>
-        <w:t xml:space="preserve">{{ risk.severity }}</w:t>
-      </w:r>
-      <w:r>
-        <w:rPr>
-          <w:b/>
-        </w:rPr>
-        <w:t xml:space="preserve">  ·  </w:t>
-      </w:r>
-      <w:r>
-        <w:rPr>
-          <w:b/>
-        </w:rPr>
-        <w:t xml:space="preserve">{{ risk.verdict }}</w:t>
+        <w:t xml:space="preserve">{{ risk.issue }}  ·  {{ risk.severity }}  ·  {{ risk.verdict }}</w:t>
       </w:r>
     </w:p>
     <w:p>
@@ -963,17 +824,11 @@
         <w:pStyle w:val="BodyText"/>
       </w:pPr>
       <w:r>
-        <w:t xml:space="preserve"/>
-      </w:r>
-      <w:r>
         <w:t xml:space="preserve">{{ risk.rationale }}</w:t>
       </w:r>
     </w:p>
     <w:p>
       <w:r>
-        <w:t xml:space="preserve"/>
-      </w:r>
-      <w:r>
         <w:t xml:space="preserve">{% if hasCitation %}</w:t>
       </w:r>
     </w:p>
@@ -982,41 +837,26 @@
         <w:pStyle w:val="Caption"/>
       </w:pPr>
       <w:r>
-        <w:t xml:space="preserve">Citation: </w:t>
-      </w:r>
-      <w:r>
-        <w:t xml:space="preserve">{{ risk.citation }}</w:t>
-      </w:r>
-    </w:p>
-    <w:p>
-      <w:r>
-        <w:t xml:space="preserve"/>
-      </w:r>
+        <w:t xml:space="preserve">Citation: {{ risk.citation }}</w:t>
+      </w:r>
+    </w:p>
+    <w:p>
       <w:r>
         <w:t xml:space="preserve">{% endif %}</w:t>
       </w:r>
     </w:p>
     <w:p>
       <w:r>
-        <w:t xml:space="preserve"/>
-      </w:r>
-      <w:r>
         <w:t xml:space="preserve">{% endfor %}</w:t>
       </w:r>
     </w:p>
     <w:p>
       <w:r>
-        <w:t xml:space="preserve"/>
-      </w:r>
-      <w:r>
         <w:t xml:space="preserve">{% endif %}</w:t>
       </w:r>
     </w:p>
     <w:p>
       <w:r>
-        <w:t xml:space="preserve"/>
-      </w:r>
-      <w:r>
         <w:t xml:space="preserve">{% if aiNarrative %}</w:t>
       </w:r>
     </w:p>
@@ -1033,24 +873,15 @@
         <w:pStyle w:val="BodyText"/>
       </w:pPr>
       <w:r>
-        <w:t xml:space="preserve"/>
-      </w:r>
-      <w:r>
         <w:t xml:space="preserve">{{ contract.summary }}</w:t>
       </w:r>
     </w:p>
     <w:p>
       <w:r>
-        <w:t xml:space="preserve"/>
-      </w:r>
-      <w:r>
         <w:t xml:space="preserve">{% endif %}</w:t>
       </w:r>
     </w:p>
     <w:p>
-      <w:r>
-        <w:t xml:space="preserve"/>
-      </w:r>
       <w:r>
         <w:t xml:space="preserve">{% endfor %}</w:t>
       </w:r>
@@ -1155,9 +986,6 @@
           </w:tcPr>
           <w:p>
             <w:r>
-              <w:t xml:space="preserve"/>
-            </w:r>
-            <w:r>
               <w:t xml:space="preserve">{% for row in grid.rows %}</w:t>
             </w:r>
           </w:p>
@@ -1171,14 +999,6 @@
                 <w:sz w:val="20"/>
                 <w:szCs w:val="20"/>
               </w:rPr>
-              <w:t xml:space="preserve"/>
-            </w:r>
-            <w:r>
-              <w:rPr>
-                <w:b/>
-                <w:sz w:val="20"/>
-                <w:szCs w:val="20"/>
-              </w:rPr>
               <w:t xml:space="preserve">{{ row.name }}</w:t>
             </w:r>
           </w:p>
@@ -1197,20 +1017,10 @@
                 <w:sz w:val="20"/>
                 <w:szCs w:val="20"/>
               </w:rPr>
-              <w:t xml:space="preserve"/>
-            </w:r>
-            <w:r>
-              <w:rPr>
-                <w:sz w:val="20"/>
-                <w:szCs w:val="20"/>
-              </w:rPr>
               <w:t xml:space="preserve">{{ row.summary }}</w:t>
             </w:r>
           </w:p>
           <w:p>
-            <w:r>
-              <w:t xml:space="preserve"/>
-            </w:r>
             <w:r>
               <w:t xml:space="preserve">{% endfor %}</w:t>
             </w:r>

</xml_diff>